<commit_message>
fix(contrato): activeTask como objeto, DELETE asíncrono y TASK_FINISHED completo
</commit_message>
<xml_diff>
--- a/docs/Contrato de Integracion Etapa 1.docx
+++ b/docs/Contrato de Integracion Etapa 1.docx
@@ -57,7 +57,7 @@
         <w:spacing w:before="0" w:after="120" w:line="276" w:lineRule="auto"/>
       </w:pPr>
       <w:r>
-        <w:t>Para evitar confusiones sobre qué funciona hoy y qué está proyectado a futuro, dejamos el estado exacto de cada función:</w:t>
+        <w:t>Para evitar confusiones sobre qué funciona hoy y qué está proyectado a futuro, dejamos el estado exacto de cada función. Todas las rutas, salvo GET /api/events, requieren Authorization: Bearer &lt;token&gt;.</w:t>
       </w:r>
     </w:p>
     <w:tbl>
@@ -205,7 +205,7 @@
               <w:rPr>
                 <w:sz w:val="19"/>
               </w:rPr>
-              <w:t>Devuelve la lista de máquinas virtuales y contenedores con su uso de CPU y memoria.</w:t>
+              <w:t>Devuelve la lista de máquinas virtuales y contenedores con su uso de CPU y memoria, su IP y la tarea en curso.</w:t>
             </w:r>
           </w:p>
         </w:tc>
@@ -329,7 +329,7 @@
               <w:rPr>
                 <w:sz w:val="19"/>
               </w:rPr>
-              <w:t>Ordena apagar una máquina o contenedor de forma limpia.</w:t>
+              <w:t>Ordena apagar (forzado) una máquina o contenedor. Devuelve 202.</w:t>
             </w:r>
           </w:p>
         </w:tc>
@@ -391,7 +391,131 @@
               <w:rPr>
                 <w:sz w:val="19"/>
               </w:rPr>
-              <w:t>Permite enviar acciones adicionales (start, stop, shutdown, reboot).</w:t>
+              <w:t>Permite enviar acciones adicionales (start, stop, shutdown, reboot). Devuelve 202.</w:t>
+            </w:r>
+          </w:p>
+        </w:tc>
+      </w:tr>
+      <w:tr>
+        <w:tc>
+          <w:tcPr>
+            <w:tcW w:type="dxa" w:w="3216"/>
+            <w:shd w:fill="FFFFFF"/>
+            <w:tcMar>
+              <w:top w:w="100" w:type="dxa"/>
+              <w:bottom w:w="100" w:type="dxa"/>
+              <w:left w:w="140" w:type="dxa"/>
+              <w:right w:w="140" w:type="dxa"/>
+            </w:tcMar>
+          </w:tcPr>
+          <w:p>
+            <w:r>
+              <w:rPr>
+                <w:sz w:val="19"/>
+              </w:rPr>
+              <w:t>DELETE /api/instances/:vmid</w:t>
+            </w:r>
+          </w:p>
+        </w:tc>
+        <w:tc>
+          <w:tcPr>
+            <w:tcW w:type="dxa" w:w="3216"/>
+            <w:shd w:fill="FFFFFF"/>
+            <w:tcMar>
+              <w:top w:w="100" w:type="dxa"/>
+              <w:bottom w:w="100" w:type="dxa"/>
+              <w:left w:w="140" w:type="dxa"/>
+              <w:right w:w="140" w:type="dxa"/>
+            </w:tcMar>
+          </w:tcPr>
+          <w:p>
+            <w:r>
+              <w:rPr>
+                <w:sz w:val="19"/>
+              </w:rPr>
+              <w:t>Operativo (solo ADMIN)</w:t>
+            </w:r>
+          </w:p>
+        </w:tc>
+        <w:tc>
+          <w:tcPr>
+            <w:tcW w:type="dxa" w:w="3216"/>
+            <w:shd w:fill="FFFFFF"/>
+            <w:tcMar>
+              <w:top w:w="100" w:type="dxa"/>
+              <w:bottom w:w="100" w:type="dxa"/>
+              <w:left w:w="140" w:type="dxa"/>
+              <w:right w:w="140" w:type="dxa"/>
+            </w:tcMar>
+          </w:tcPr>
+          <w:p>
+            <w:r>
+              <w:rPr>
+                <w:sz w:val="19"/>
+              </w:rPr>
+              <w:t>Elimina para siempre una máquina o contenedor detenido. Es asíncrono: devuelve 202 con upid y tareaId.</w:t>
+            </w:r>
+          </w:p>
+        </w:tc>
+      </w:tr>
+      <w:tr>
+        <w:tc>
+          <w:tcPr>
+            <w:tcW w:type="dxa" w:w="3216"/>
+            <w:shd w:fill="F9FBFC"/>
+            <w:tcMar>
+              <w:top w:w="100" w:type="dxa"/>
+              <w:bottom w:w="100" w:type="dxa"/>
+              <w:left w:w="140" w:type="dxa"/>
+              <w:right w:w="140" w:type="dxa"/>
+            </w:tcMar>
+          </w:tcPr>
+          <w:p>
+            <w:r>
+              <w:rPr>
+                <w:sz w:val="19"/>
+              </w:rPr>
+              <w:t>GET /api/node/status</w:t>
+            </w:r>
+          </w:p>
+        </w:tc>
+        <w:tc>
+          <w:tcPr>
+            <w:tcW w:type="dxa" w:w="3216"/>
+            <w:shd w:fill="F9FBFC"/>
+            <w:tcMar>
+              <w:top w:w="100" w:type="dxa"/>
+              <w:bottom w:w="100" w:type="dxa"/>
+              <w:left w:w="140" w:type="dxa"/>
+              <w:right w:w="140" w:type="dxa"/>
+            </w:tcMar>
+          </w:tcPr>
+          <w:p>
+            <w:r>
+              <w:rPr>
+                <w:sz w:val="19"/>
+              </w:rPr>
+              <w:t>Operativo (ADMIN y OPERATOR)</w:t>
+            </w:r>
+          </w:p>
+        </w:tc>
+        <w:tc>
+          <w:tcPr>
+            <w:tcW w:type="dxa" w:w="3216"/>
+            <w:shd w:fill="F9FBFC"/>
+            <w:tcMar>
+              <w:top w:w="100" w:type="dxa"/>
+              <w:bottom w:w="100" w:type="dxa"/>
+              <w:left w:w="140" w:type="dxa"/>
+              <w:right w:w="140" w:type="dxa"/>
+            </w:tcMar>
+          </w:tcPr>
+          <w:p>
+            <w:r>
+              <w:rPr>
+                <w:sz w:val="19"/>
+              </w:rPr>
+              <w:t>Métricas globales del servidor físico (CPU, RAM, disco, uptime y totales de instancias).</w:t>
             </w:r>
           </w:p>
         </w:tc>
@@ -537,7 +661,7 @@
               <w:rPr>
                 <w:sz w:val="19"/>
               </w:rPr>
-              <w:t>GET /api/node/status</w:t>
+              <w:t>POST /api/instances/:vmid/pause</w:t>
             </w:r>
           </w:p>
         </w:tc>
@@ -557,7 +681,7 @@
               <w:rPr>
                 <w:sz w:val="19"/>
               </w:rPr>
-              <w:t>Planificado (404)</w:t>
+              <w:t>No implementado</w:t>
             </w:r>
           </w:p>
         </w:tc>
@@ -565,68 +689,6 @@
           <w:tcPr>
             <w:tcW w:type="dxa" w:w="3216"/>
             <w:shd w:fill="FFFFFF"/>
-            <w:tcMar>
-              <w:top w:w="100" w:type="dxa"/>
-              <w:bottom w:w="100" w:type="dxa"/>
-              <w:left w:w="140" w:type="dxa"/>
-              <w:right w:w="140" w:type="dxa"/>
-            </w:tcMar>
-          </w:tcPr>
-          <w:p>
-            <w:r>
-              <w:rPr>
-                <w:sz w:val="19"/>
-              </w:rPr>
-              <w:t>Consultará métricas globales del servidor físico. Aún no está implementado.</w:t>
-            </w:r>
-          </w:p>
-        </w:tc>
-      </w:tr>
-      <w:tr>
-        <w:tc>
-          <w:tcPr>
-            <w:tcW w:type="dxa" w:w="3216"/>
-            <w:shd w:fill="F9FBFC"/>
-            <w:tcMar>
-              <w:top w:w="100" w:type="dxa"/>
-              <w:bottom w:w="100" w:type="dxa"/>
-              <w:left w:w="140" w:type="dxa"/>
-              <w:right w:w="140" w:type="dxa"/>
-            </w:tcMar>
-          </w:tcPr>
-          <w:p>
-            <w:r>
-              <w:rPr>
-                <w:sz w:val="19"/>
-              </w:rPr>
-              <w:t>POST /api/instances/:vmid/pause</w:t>
-            </w:r>
-          </w:p>
-        </w:tc>
-        <w:tc>
-          <w:tcPr>
-            <w:tcW w:type="dxa" w:w="3216"/>
-            <w:shd w:fill="F9FBFC"/>
-            <w:tcMar>
-              <w:top w:w="100" w:type="dxa"/>
-              <w:bottom w:w="100" w:type="dxa"/>
-              <w:left w:w="140" w:type="dxa"/>
-              <w:right w:w="140" w:type="dxa"/>
-            </w:tcMar>
-          </w:tcPr>
-          <w:p>
-            <w:r>
-              <w:rPr>
-                <w:sz w:val="19"/>
-              </w:rPr>
-              <w:t>No implementado</w:t>
-            </w:r>
-          </w:p>
-        </w:tc>
-        <w:tc>
-          <w:tcPr>
-            <w:tcW w:type="dxa" w:w="3216"/>
-            <w:shd w:fill="F9FBFC"/>
             <w:tcMar>
               <w:top w:w="100" w:type="dxa"/>
               <w:bottom w:w="100" w:type="dxa"/>
@@ -1150,7 +1212,7 @@
               <w:rPr>
                 <w:sz w:val="19"/>
               </w:rPr>
-              <w:t>Dirección IP detectada. Actualmente el servidor envía null hasta la siguiente etapa.</w:t>
+              <w:t>Primera IPv4 detectada (o IPv6 global si no hay). null si la máquina está apagada, no tiene agente o red, o no respondió a tiempo.</w:t>
             </w:r>
           </w:p>
         </w:tc>
@@ -1440,7 +1502,7 @@
               <w:rPr>
                 <w:sz w:val="19"/>
               </w:rPr>
-              <w:t>Texto o null</w:t>
+              <w:t>Objeto o null</w:t>
             </w:r>
           </w:p>
         </w:tc>
@@ -1460,7 +1522,301 @@
               <w:rPr>
                 <w:sz w:val="19"/>
               </w:rPr>
-              <w:t>Identificador de tarea si la máquina está haciendo algo, o null si está libre.</w:t>
+              <w:t>La tarea que la máquina está ejecutando ahora: { tareaId, action, status }. null si está libre.</w:t>
+            </w:r>
+          </w:p>
+        </w:tc>
+      </w:tr>
+    </w:tbl>
+    <w:p>
+      <w:pPr>
+        <w:spacing w:after="120"/>
+      </w:pPr>
+    </w:p>
+    <w:p>
+      <w:pPr>
+        <w:spacing w:before="0" w:after="120" w:line="276" w:lineRule="auto"/>
+      </w:pPr>
+      <w:r>
+        <w:rPr>
+          <w:b/>
+        </w:rPr>
+        <w:t xml:space="preserve">Detalle de activeTask: </w:t>
+      </w:r>
+      <w:r>
+        <w:t>Cuando la máquina tiene una tarea en curso, activeTask trae estos tres campos:</w:t>
+      </w:r>
+    </w:p>
+    <w:tbl>
+      <w:tblPr>
+        <w:tblW w:type="auto" w:w="0"/>
+        <w:jc w:val="center"/>
+        <w:tblLook w:firstColumn="1" w:firstRow="1" w:lastColumn="0" w:lastRow="0" w:noHBand="0" w:noVBand="1" w:val="04A0"/>
+      </w:tblPr>
+      <w:tblGrid>
+        <w:gridCol w:w="3216"/>
+        <w:gridCol w:w="3216"/>
+        <w:gridCol w:w="3216"/>
+      </w:tblGrid>
+      <w:tr>
+        <w:tc>
+          <w:tcPr>
+            <w:tcW w:type="dxa" w:w="3216"/>
+            <w:shd w:fill="0F4C81"/>
+            <w:tcMar>
+              <w:top w:w="120" w:type="dxa"/>
+              <w:bottom w:w="120" w:type="dxa"/>
+              <w:left w:w="140" w:type="dxa"/>
+              <w:right w:w="140" w:type="dxa"/>
+            </w:tcMar>
+          </w:tcPr>
+          <w:p>
+            <w:pPr>
+              <w:jc w:val="left"/>
+            </w:pPr>
+            <w:r>
+              <w:rPr>
+                <w:b/>
+                <w:color w:val="FFFFFF"/>
+                <w:sz w:val="20"/>
+              </w:rPr>
+              <w:t>Campo</w:t>
+            </w:r>
+          </w:p>
+        </w:tc>
+        <w:tc>
+          <w:tcPr>
+            <w:tcW w:type="dxa" w:w="3216"/>
+            <w:shd w:fill="0F4C81"/>
+            <w:tcMar>
+              <w:top w:w="120" w:type="dxa"/>
+              <w:bottom w:w="120" w:type="dxa"/>
+              <w:left w:w="140" w:type="dxa"/>
+              <w:right w:w="140" w:type="dxa"/>
+            </w:tcMar>
+          </w:tcPr>
+          <w:p>
+            <w:pPr>
+              <w:jc w:val="left"/>
+            </w:pPr>
+            <w:r>
+              <w:rPr>
+                <w:b/>
+                <w:color w:val="FFFFFF"/>
+                <w:sz w:val="20"/>
+              </w:rPr>
+              <w:t>Tipo de Dato</w:t>
+            </w:r>
+          </w:p>
+        </w:tc>
+        <w:tc>
+          <w:tcPr>
+            <w:tcW w:type="dxa" w:w="3216"/>
+            <w:shd w:fill="0F4C81"/>
+            <w:tcMar>
+              <w:top w:w="120" w:type="dxa"/>
+              <w:bottom w:w="120" w:type="dxa"/>
+              <w:left w:w="140" w:type="dxa"/>
+              <w:right w:w="140" w:type="dxa"/>
+            </w:tcMar>
+          </w:tcPr>
+          <w:p>
+            <w:pPr>
+              <w:jc w:val="left"/>
+            </w:pPr>
+            <w:r>
+              <w:rPr>
+                <w:b/>
+                <w:color w:val="FFFFFF"/>
+                <w:sz w:val="20"/>
+              </w:rPr>
+              <w:t>Significado / Regla</w:t>
+            </w:r>
+          </w:p>
+        </w:tc>
+      </w:tr>
+      <w:tr>
+        <w:tc>
+          <w:tcPr>
+            <w:tcW w:type="dxa" w:w="3216"/>
+            <w:shd w:fill="FFFFFF"/>
+            <w:tcMar>
+              <w:top w:w="100" w:type="dxa"/>
+              <w:bottom w:w="100" w:type="dxa"/>
+              <w:left w:w="140" w:type="dxa"/>
+              <w:right w:w="140" w:type="dxa"/>
+            </w:tcMar>
+          </w:tcPr>
+          <w:p>
+            <w:r>
+              <w:rPr>
+                <w:sz w:val="19"/>
+              </w:rPr>
+              <w:t>tareaId</w:t>
+            </w:r>
+          </w:p>
+        </w:tc>
+        <w:tc>
+          <w:tcPr>
+            <w:tcW w:type="dxa" w:w="3216"/>
+            <w:shd w:fill="FFFFFF"/>
+            <w:tcMar>
+              <w:top w:w="100" w:type="dxa"/>
+              <w:bottom w:w="100" w:type="dxa"/>
+              <w:left w:w="140" w:type="dxa"/>
+              <w:right w:w="140" w:type="dxa"/>
+            </w:tcMar>
+          </w:tcPr>
+          <w:p>
+            <w:r>
+              <w:rPr>
+                <w:sz w:val="19"/>
+              </w:rPr>
+              <w:t>Texto (UUID)</w:t>
+            </w:r>
+          </w:p>
+        </w:tc>
+        <w:tc>
+          <w:tcPr>
+            <w:tcW w:type="dxa" w:w="3216"/>
+            <w:shd w:fill="FFFFFF"/>
+            <w:tcMar>
+              <w:top w:w="100" w:type="dxa"/>
+              <w:bottom w:w="100" w:type="dxa"/>
+              <w:left w:w="140" w:type="dxa"/>
+              <w:right w:w="140" w:type="dxa"/>
+            </w:tcMar>
+          </w:tcPr>
+          <w:p>
+            <w:r>
+              <w:rPr>
+                <w:sz w:val="19"/>
+              </w:rPr>
+              <w:t>El mismo tareaId que devolvió el 202 de la acción y que llega en el evento TASK_FINISHED.</w:t>
+            </w:r>
+          </w:p>
+        </w:tc>
+      </w:tr>
+      <w:tr>
+        <w:tc>
+          <w:tcPr>
+            <w:tcW w:type="dxa" w:w="3216"/>
+            <w:shd w:fill="F9FBFC"/>
+            <w:tcMar>
+              <w:top w:w="100" w:type="dxa"/>
+              <w:bottom w:w="100" w:type="dxa"/>
+              <w:left w:w="140" w:type="dxa"/>
+              <w:right w:w="140" w:type="dxa"/>
+            </w:tcMar>
+          </w:tcPr>
+          <w:p>
+            <w:r>
+              <w:rPr>
+                <w:sz w:val="19"/>
+              </w:rPr>
+              <w:t>action</w:t>
+            </w:r>
+          </w:p>
+        </w:tc>
+        <w:tc>
+          <w:tcPr>
+            <w:tcW w:type="dxa" w:w="3216"/>
+            <w:shd w:fill="F9FBFC"/>
+            <w:tcMar>
+              <w:top w:w="100" w:type="dxa"/>
+              <w:bottom w:w="100" w:type="dxa"/>
+              <w:left w:w="140" w:type="dxa"/>
+              <w:right w:w="140" w:type="dxa"/>
+            </w:tcMar>
+          </w:tcPr>
+          <w:p>
+            <w:r>
+              <w:rPr>
+                <w:sz w:val="19"/>
+              </w:rPr>
+              <w:t>Texto</w:t>
+            </w:r>
+          </w:p>
+        </w:tc>
+        <w:tc>
+          <w:tcPr>
+            <w:tcW w:type="dxa" w:w="3216"/>
+            <w:shd w:fill="F9FBFC"/>
+            <w:tcMar>
+              <w:top w:w="100" w:type="dxa"/>
+              <w:bottom w:w="100" w:type="dxa"/>
+              <w:left w:w="140" w:type="dxa"/>
+              <w:right w:w="140" w:type="dxa"/>
+            </w:tcMar>
+          </w:tcPr>
+          <w:p>
+            <w:r>
+              <w:rPr>
+                <w:sz w:val="19"/>
+              </w:rPr>
+              <w:t>START, STOP, SHUTDOWN, REBOOT o DELETE (en mayúsculas).</w:t>
+            </w:r>
+          </w:p>
+        </w:tc>
+      </w:tr>
+      <w:tr>
+        <w:tc>
+          <w:tcPr>
+            <w:tcW w:type="dxa" w:w="3216"/>
+            <w:shd w:fill="FFFFFF"/>
+            <w:tcMar>
+              <w:top w:w="100" w:type="dxa"/>
+              <w:bottom w:w="100" w:type="dxa"/>
+              <w:left w:w="140" w:type="dxa"/>
+              <w:right w:w="140" w:type="dxa"/>
+            </w:tcMar>
+          </w:tcPr>
+          <w:p>
+            <w:r>
+              <w:rPr>
+                <w:sz w:val="19"/>
+              </w:rPr>
+              <w:t>status</w:t>
+            </w:r>
+          </w:p>
+        </w:tc>
+        <w:tc>
+          <w:tcPr>
+            <w:tcW w:type="dxa" w:w="3216"/>
+            <w:shd w:fill="FFFFFF"/>
+            <w:tcMar>
+              <w:top w:w="100" w:type="dxa"/>
+              <w:bottom w:w="100" w:type="dxa"/>
+              <w:left w:w="140" w:type="dxa"/>
+              <w:right w:w="140" w:type="dxa"/>
+            </w:tcMar>
+          </w:tcPr>
+          <w:p>
+            <w:r>
+              <w:rPr>
+                <w:sz w:val="19"/>
+              </w:rPr>
+              <w:t>Texto</w:t>
+            </w:r>
+          </w:p>
+        </w:tc>
+        <w:tc>
+          <w:tcPr>
+            <w:tcW w:type="dxa" w:w="3216"/>
+            <w:shd w:fill="FFFFFF"/>
+            <w:tcMar>
+              <w:top w:w="100" w:type="dxa"/>
+              <w:bottom w:w="100" w:type="dxa"/>
+              <w:left w:w="140" w:type="dxa"/>
+              <w:right w:w="140" w:type="dxa"/>
+            </w:tcMar>
+          </w:tcPr>
+          <w:p>
+            <w:r>
+              <w:rPr>
+                <w:sz w:val="19"/>
+              </w:rPr>
+              <w:t>Siempre RUNNING. Cuando la tarea termina, activeTask vuelve a null.</w:t>
             </w:r>
           </w:p>
         </w:tc>
@@ -1524,7 +1880,7 @@
               <w:br/>
               <w:t xml:space="preserve">    "status": "running",</w:t>
               <w:br/>
-              <w:t xml:space="preserve">    "ip": null,</w:t>
+              <w:t xml:space="preserve">    "ip": "192.168.1.110",</w:t>
               <w:br/>
               <w:t xml:space="preserve">    "cpuUsage": 0.24,</w:t>
               <w:br/>
@@ -1536,6 +1892,40 @@
               <w:br/>
               <w:t xml:space="preserve">    "activeTask": null</w:t>
               <w:br/>
+              <w:t xml:space="preserve">  },</w:t>
+              <w:br/>
+              <w:t xml:space="preserve">  {</w:t>
+              <w:br/>
+              <w:t xml:space="preserve">    "id": 201,</w:t>
+              <w:br/>
+              <w:t xml:space="preserve">    "name": "db-pruebas",</w:t>
+              <w:br/>
+              <w:t xml:space="preserve">    "type": "lxc",</w:t>
+              <w:br/>
+              <w:t xml:space="preserve">    "node": "pve-01",</w:t>
+              <w:br/>
+              <w:t xml:space="preserve">    "status": "stopped",</w:t>
+              <w:br/>
+              <w:t xml:space="preserve">    "ip": null,</w:t>
+              <w:br/>
+              <w:t xml:space="preserve">    "cpuUsage": 0,</w:t>
+              <w:br/>
+              <w:t xml:space="preserve">    "ramUsage": 0,</w:t>
+              <w:br/>
+              <w:t xml:space="preserve">    "maxRam": 1073741824,</w:t>
+              <w:br/>
+              <w:t xml:space="preserve">    "nivelAcceso": "FULL_ACCESS",</w:t>
+              <w:br/>
+              <w:t xml:space="preserve">    "activeTask": {</w:t>
+              <w:br/>
+              <w:t xml:space="preserve">      "tareaId": "3f2504e0-4f89-11d3-9a0c-0305e82c3301",</w:t>
+              <w:br/>
+              <w:t xml:space="preserve">      "action": "START",</w:t>
+              <w:br/>
+              <w:t xml:space="preserve">      "status": "RUNNING"</w:t>
+              <w:br/>
+              <w:t xml:space="preserve">    }</w:t>
+              <w:br/>
               <w:t xml:space="preserve">  }</w:t>
               <w:br/>
               <w:t>]</w:t>
@@ -1546,7 +1936,7 @@
     </w:tbl>
     <w:p>
       <w:pPr>
-        <w:spacing w:after="80"/>
+        <w:spacing w:after="120"/>
       </w:pPr>
     </w:p>
     <w:p>
@@ -1561,7 +1951,7 @@
           <w:color w:val="0F4C81"/>
           <w:sz w:val="28"/>
         </w:rPr>
-        <w:t>3. Acciones de Energía (Encendido, Apagado y Reinicio)</w:t>
+        <w:t>3. Acciones de Energía y Borrado</w:t>
       </w:r>
     </w:p>
     <w:p>
@@ -1569,7 +1959,7 @@
         <w:spacing w:before="0" w:after="120" w:line="276" w:lineRule="auto"/>
       </w:pPr>
       <w:r>
-        <w:t>Las acciones se envían siempre con método POST. Al solicitar encender o apagar, el servidor no bloquea la conexión esperando que la máquina termine de arrancar (lo cual puede demorar varios minutos). En su lugar, responde de inmediato con código 202 Accepted, indicando que la orden fue recibida y enviada a Proxmox.</w:t>
+        <w:t>Las acciones de energía se envían siempre con método POST; el borrado, con DELETE. Al solicitar una acción, el servidor no bloquea la conexión esperando que la máquina termine (lo cual puede demorar varios minutos). En su lugar, responde de inmediato con código 202 Accepted, indicando que la orden fue recibida y enviada a Proxmox.</w:t>
       </w:r>
     </w:p>
     <w:p>
@@ -1631,7 +2021,7 @@
     </w:tbl>
     <w:p>
       <w:pPr>
-        <w:spacing w:after="80"/>
+        <w:spacing w:after="120"/>
       </w:pPr>
     </w:p>
     <w:tbl>
@@ -1670,7 +2060,7 @@
               <w:rPr>
                 <w:sz w:val="20"/>
               </w:rPr>
-              <w:t>El código 202 significa que la orden se puso en cola, no que la máquina ya terminó de prenderse. Para saber cuándo finalizó efectivamente la tarea, el frontend debe escuchar el canal de eventos en tiempo real o refrescar el listado.</w:t>
+              <w:t>El código 202 significa que la orden se puso en cola, no que la máquina ya terminó. Para saber cuándo finalizó efectivamente la tarea, el frontend debe escuchar el canal de eventos en tiempo real o refrescar el listado (mientras dura, la máquina aparece con activeTask). Si el backend no pudo registrar la tarea, la respuesta trae solo upid: no es un error.</w:t>
             </w:r>
           </w:p>
         </w:tc>
@@ -1678,7 +2068,389 @@
     </w:tbl>
     <w:p>
       <w:pPr>
-        <w:spacing w:after="80"/>
+        <w:spacing w:after="120"/>
+      </w:pPr>
+    </w:p>
+    <w:p>
+      <w:pPr>
+        <w:keepNext/>
+        <w:spacing w:before="240" w:after="80"/>
+      </w:pPr>
+      <w:r>
+        <w:rPr>
+          <w:rFonts w:ascii="Segoe UI" w:hAnsi="Segoe UI"/>
+          <w:b/>
+          <w:color w:val="2A6496"/>
+          <w:sz w:val="23"/>
+        </w:rPr>
+        <w:t>Antes de mandar la orden: estado requerido</w:t>
+      </w:r>
+    </w:p>
+    <w:p>
+      <w:pPr>
+        <w:spacing w:before="0" w:after="120" w:line="276" w:lineRule="auto"/>
+      </w:pPr>
+      <w:r>
+        <w:t>El servidor revisa el estado de la máquina antes de tocar Proxmox. Si no es el que la acción necesita, responde 409 INSTANCE_INVALID_STATE y no hace nada:</w:t>
+      </w:r>
+    </w:p>
+    <w:tbl>
+      <w:tblPr>
+        <w:tblW w:type="auto" w:w="0"/>
+        <w:jc w:val="center"/>
+        <w:tblLook w:firstColumn="1" w:firstRow="1" w:lastColumn="0" w:lastRow="0" w:noHBand="0" w:noVBand="1" w:val="04A0"/>
+      </w:tblPr>
+      <w:tblGrid>
+        <w:gridCol w:w="3216"/>
+        <w:gridCol w:w="3216"/>
+        <w:gridCol w:w="3216"/>
+      </w:tblGrid>
+      <w:tr>
+        <w:tc>
+          <w:tcPr>
+            <w:tcW w:type="dxa" w:w="3216"/>
+            <w:shd w:fill="0F4C81"/>
+            <w:tcMar>
+              <w:top w:w="120" w:type="dxa"/>
+              <w:bottom w:w="120" w:type="dxa"/>
+              <w:left w:w="140" w:type="dxa"/>
+              <w:right w:w="140" w:type="dxa"/>
+            </w:tcMar>
+          </w:tcPr>
+          <w:p>
+            <w:pPr>
+              <w:jc w:val="left"/>
+            </w:pPr>
+            <w:r>
+              <w:rPr>
+                <w:b/>
+                <w:color w:val="FFFFFF"/>
+                <w:sz w:val="20"/>
+              </w:rPr>
+              <w:t>Acción</w:t>
+            </w:r>
+          </w:p>
+        </w:tc>
+        <w:tc>
+          <w:tcPr>
+            <w:tcW w:type="dxa" w:w="3216"/>
+            <w:shd w:fill="0F4C81"/>
+            <w:tcMar>
+              <w:top w:w="120" w:type="dxa"/>
+              <w:bottom w:w="120" w:type="dxa"/>
+              <w:left w:w="140" w:type="dxa"/>
+              <w:right w:w="140" w:type="dxa"/>
+            </w:tcMar>
+          </w:tcPr>
+          <w:p>
+            <w:pPr>
+              <w:jc w:val="left"/>
+            </w:pPr>
+            <w:r>
+              <w:rPr>
+                <w:b/>
+                <w:color w:val="FFFFFF"/>
+                <w:sz w:val="20"/>
+              </w:rPr>
+              <w:t>Estado requerido</w:t>
+            </w:r>
+          </w:p>
+        </w:tc>
+        <w:tc>
+          <w:tcPr>
+            <w:tcW w:type="dxa" w:w="3216"/>
+            <w:shd w:fill="0F4C81"/>
+            <w:tcMar>
+              <w:top w:w="120" w:type="dxa"/>
+              <w:bottom w:w="120" w:type="dxa"/>
+              <w:left w:w="140" w:type="dxa"/>
+              <w:right w:w="140" w:type="dxa"/>
+            </w:tcMar>
+          </w:tcPr>
+          <w:p>
+            <w:pPr>
+              <w:jc w:val="left"/>
+            </w:pPr>
+            <w:r>
+              <w:rPr>
+                <w:b/>
+                <w:color w:val="FFFFFF"/>
+                <w:sz w:val="20"/>
+              </w:rPr>
+              <w:t>Si no se cumple</w:t>
+            </w:r>
+          </w:p>
+        </w:tc>
+      </w:tr>
+      <w:tr>
+        <w:tc>
+          <w:tcPr>
+            <w:tcW w:type="dxa" w:w="3216"/>
+            <w:shd w:fill="FFFFFF"/>
+            <w:tcMar>
+              <w:top w:w="100" w:type="dxa"/>
+              <w:bottom w:w="100" w:type="dxa"/>
+              <w:left w:w="140" w:type="dxa"/>
+              <w:right w:w="140" w:type="dxa"/>
+            </w:tcMar>
+          </w:tcPr>
+          <w:p>
+            <w:r>
+              <w:rPr>
+                <w:sz w:val="19"/>
+              </w:rPr>
+              <w:t>start</w:t>
+            </w:r>
+          </w:p>
+        </w:tc>
+        <w:tc>
+          <w:tcPr>
+            <w:tcW w:type="dxa" w:w="3216"/>
+            <w:shd w:fill="FFFFFF"/>
+            <w:tcMar>
+              <w:top w:w="100" w:type="dxa"/>
+              <w:bottom w:w="100" w:type="dxa"/>
+              <w:left w:w="140" w:type="dxa"/>
+              <w:right w:w="140" w:type="dxa"/>
+            </w:tcMar>
+          </w:tcPr>
+          <w:p>
+            <w:r>
+              <w:rPr>
+                <w:sz w:val="19"/>
+              </w:rPr>
+              <w:t>stopped</w:t>
+            </w:r>
+          </w:p>
+        </w:tc>
+        <w:tc>
+          <w:tcPr>
+            <w:tcW w:type="dxa" w:w="3216"/>
+            <w:shd w:fill="FFFFFF"/>
+            <w:tcMar>
+              <w:top w:w="100" w:type="dxa"/>
+              <w:bottom w:w="100" w:type="dxa"/>
+              <w:left w:w="140" w:type="dxa"/>
+              <w:right w:w="140" w:type="dxa"/>
+            </w:tcMar>
+          </w:tcPr>
+          <w:p>
+            <w:r>
+              <w:rPr>
+                <w:sz w:val="19"/>
+              </w:rPr>
+              <w:t>409 INSTANCE_INVALID_STATE</w:t>
+            </w:r>
+          </w:p>
+        </w:tc>
+      </w:tr>
+      <w:tr>
+        <w:tc>
+          <w:tcPr>
+            <w:tcW w:type="dxa" w:w="3216"/>
+            <w:shd w:fill="F9FBFC"/>
+            <w:tcMar>
+              <w:top w:w="100" w:type="dxa"/>
+              <w:bottom w:w="100" w:type="dxa"/>
+              <w:left w:w="140" w:type="dxa"/>
+              <w:right w:w="140" w:type="dxa"/>
+            </w:tcMar>
+          </w:tcPr>
+          <w:p>
+            <w:r>
+              <w:rPr>
+                <w:sz w:val="19"/>
+              </w:rPr>
+              <w:t>stop, shutdown, reboot</w:t>
+            </w:r>
+          </w:p>
+        </w:tc>
+        <w:tc>
+          <w:tcPr>
+            <w:tcW w:type="dxa" w:w="3216"/>
+            <w:shd w:fill="F9FBFC"/>
+            <w:tcMar>
+              <w:top w:w="100" w:type="dxa"/>
+              <w:bottom w:w="100" w:type="dxa"/>
+              <w:left w:w="140" w:type="dxa"/>
+              <w:right w:w="140" w:type="dxa"/>
+            </w:tcMar>
+          </w:tcPr>
+          <w:p>
+            <w:r>
+              <w:rPr>
+                <w:sz w:val="19"/>
+              </w:rPr>
+              <w:t>running</w:t>
+            </w:r>
+          </w:p>
+        </w:tc>
+        <w:tc>
+          <w:tcPr>
+            <w:tcW w:type="dxa" w:w="3216"/>
+            <w:shd w:fill="F9FBFC"/>
+            <w:tcMar>
+              <w:top w:w="100" w:type="dxa"/>
+              <w:bottom w:w="100" w:type="dxa"/>
+              <w:left w:w="140" w:type="dxa"/>
+              <w:right w:w="140" w:type="dxa"/>
+            </w:tcMar>
+          </w:tcPr>
+          <w:p>
+            <w:r>
+              <w:rPr>
+                <w:sz w:val="19"/>
+              </w:rPr>
+              <w:t>409 INSTANCE_INVALID_STATE</w:t>
+            </w:r>
+          </w:p>
+        </w:tc>
+      </w:tr>
+      <w:tr>
+        <w:tc>
+          <w:tcPr>
+            <w:tcW w:type="dxa" w:w="3216"/>
+            <w:shd w:fill="FFFFFF"/>
+            <w:tcMar>
+              <w:top w:w="100" w:type="dxa"/>
+              <w:bottom w:w="100" w:type="dxa"/>
+              <w:left w:w="140" w:type="dxa"/>
+              <w:right w:w="140" w:type="dxa"/>
+            </w:tcMar>
+          </w:tcPr>
+          <w:p>
+            <w:r>
+              <w:rPr>
+                <w:sz w:val="19"/>
+              </w:rPr>
+              <w:t>DELETE (borrado)</w:t>
+            </w:r>
+          </w:p>
+        </w:tc>
+        <w:tc>
+          <w:tcPr>
+            <w:tcW w:type="dxa" w:w="3216"/>
+            <w:shd w:fill="FFFFFF"/>
+            <w:tcMar>
+              <w:top w:w="100" w:type="dxa"/>
+              <w:bottom w:w="100" w:type="dxa"/>
+              <w:left w:w="140" w:type="dxa"/>
+              <w:right w:w="140" w:type="dxa"/>
+            </w:tcMar>
+          </w:tcPr>
+          <w:p>
+            <w:r>
+              <w:rPr>
+                <w:sz w:val="19"/>
+              </w:rPr>
+              <w:t>stopped</w:t>
+            </w:r>
+          </w:p>
+        </w:tc>
+        <w:tc>
+          <w:tcPr>
+            <w:tcW w:type="dxa" w:w="3216"/>
+            <w:shd w:fill="FFFFFF"/>
+            <w:tcMar>
+              <w:top w:w="100" w:type="dxa"/>
+              <w:bottom w:w="100" w:type="dxa"/>
+              <w:left w:w="140" w:type="dxa"/>
+              <w:right w:w="140" w:type="dxa"/>
+            </w:tcMar>
+          </w:tcPr>
+          <w:p>
+            <w:r>
+              <w:rPr>
+                <w:sz w:val="19"/>
+              </w:rPr>
+              <w:t>409 INSTANCE_NOT_STOPPED</w:t>
+            </w:r>
+          </w:p>
+        </w:tc>
+      </w:tr>
+    </w:tbl>
+    <w:p>
+      <w:pPr>
+        <w:spacing w:after="120"/>
+      </w:pPr>
+    </w:p>
+    <w:p>
+      <w:pPr>
+        <w:keepNext/>
+        <w:spacing w:before="240" w:after="80"/>
+      </w:pPr>
+      <w:r>
+        <w:rPr>
+          <w:rFonts w:ascii="Segoe UI" w:hAnsi="Segoe UI"/>
+          <w:b/>
+          <w:color w:val="2A6496"/>
+          <w:sz w:val="23"/>
+        </w:rPr>
+        <w:t>Borrado de una instancia (solo ADMIN)</w:t>
+      </w:r>
+    </w:p>
+    <w:p>
+      <w:pPr>
+        <w:spacing w:before="0" w:after="120" w:line="276" w:lineRule="auto"/>
+      </w:pPr>
+      <w:r>
+        <w:t>DELETE /api/instances/:vmid elimina para siempre una máquina o contenedor. Solo lo puede usar un ADMIN: un OPERATOR recibe 403 INSUFFICIENT_PERMISSIONS. Las máquinas protegidas de la infraestructura responden 403 INSTANCE_PROTECTED.</w:t>
+      </w:r>
+    </w:p>
+    <w:p>
+      <w:pPr>
+        <w:spacing w:before="0" w:after="120" w:line="276" w:lineRule="auto"/>
+      </w:pPr>
+      <w:r>
+        <w:t>La máquina tiene que estar apagada (stopped). Si lo está, el servidor responde 202 con el mismo formato { upid, tareaId } que las acciones de energía, y el resultado llega por el canal de eventos como un TASK_FINISHED con accion DELETE. Cuando termina bien, la máquina deja de aparecer en el inventario.</w:t>
+      </w:r>
+    </w:p>
+    <w:tbl>
+      <w:tblPr>
+        <w:tblW w:type="auto" w:w="0"/>
+        <w:jc w:val="center"/>
+        <w:tblLook w:firstColumn="1" w:firstRow="1" w:lastColumn="0" w:lastRow="0" w:noHBand="0" w:noVBand="1" w:val="04A0"/>
+      </w:tblPr>
+      <w:tblGrid>
+        <w:gridCol w:w="9648"/>
+      </w:tblGrid>
+      <w:tr>
+        <w:tc>
+          <w:tcPr>
+            <w:tcW w:type="dxa" w:w="9648"/>
+            <w:shd w:fill="F8F9FA"/>
+            <w:tcMar>
+              <w:top w:w="120" w:type="dxa"/>
+              <w:bottom w:w="120" w:type="dxa"/>
+              <w:left w:w="180" w:type="dxa"/>
+              <w:right w:w="180" w:type="dxa"/>
+            </w:tcMar>
+          </w:tcPr>
+          <w:p>
+            <w:pPr>
+              <w:spacing w:before="0" w:after="0"/>
+            </w:pPr>
+            <w:r>
+              <w:rPr>
+                <w:rFonts w:ascii="Consolas" w:hAnsi="Consolas"/>
+                <w:color w:val="24292E"/>
+                <w:sz w:val="19"/>
+              </w:rPr>
+              <w:t>{</w:t>
+              <w:br/>
+              <w:t xml:space="preserve">  "upid": "UPID:pve:0008381A:0131F2C0:6A84EB10:qmdestroy:110:centinela-api@pve!backend-token:",</w:t>
+              <w:br/>
+              <w:t xml:space="preserve">  "tareaId": "3f2504e0-4f89-11d3-9a0c-0305e82c3303"</w:t>
+              <w:br/>
+              <w:t>}</w:t>
+            </w:r>
+          </w:p>
+        </w:tc>
+      </w:tr>
+    </w:tbl>
+    <w:p>
+      <w:pPr>
+        <w:spacing w:after="120"/>
       </w:pPr>
     </w:p>
     <w:p>
@@ -1749,7 +2521,7 @@
     </w:tbl>
     <w:p>
       <w:pPr>
-        <w:spacing w:after="80"/>
+        <w:spacing w:after="120"/>
       </w:pPr>
     </w:p>
     <w:p>
@@ -1927,7 +2699,7 @@
               <w:rPr>
                 <w:sz w:val="19"/>
               </w:rPr>
-              <w:t>401</w:t>
+              <w:t>400</w:t>
             </w:r>
           </w:p>
         </w:tc>
@@ -1947,7 +2719,7 @@
               <w:rPr>
                 <w:sz w:val="19"/>
               </w:rPr>
-              <w:t>MISSING_TOKEN</w:t>
+              <w:t>INVALID_ACTION</w:t>
             </w:r>
           </w:p>
         </w:tc>
@@ -1967,7 +2739,131 @@
               <w:rPr>
                 <w:sz w:val="19"/>
               </w:rPr>
-              <w:t>No se envió la cabecera de autenticación o el token es inválido.</w:t>
+              <w:t>La acción de /status/:action no es start, stop, shutdown ni reboot.</w:t>
+            </w:r>
+          </w:p>
+        </w:tc>
+      </w:tr>
+      <w:tr>
+        <w:tc>
+          <w:tcPr>
+            <w:tcW w:type="dxa" w:w="3216"/>
+            <w:shd w:fill="FFFFFF"/>
+            <w:tcMar>
+              <w:top w:w="100" w:type="dxa"/>
+              <w:bottom w:w="100" w:type="dxa"/>
+              <w:left w:w="140" w:type="dxa"/>
+              <w:right w:w="140" w:type="dxa"/>
+            </w:tcMar>
+          </w:tcPr>
+          <w:p>
+            <w:r>
+              <w:rPr>
+                <w:sz w:val="19"/>
+              </w:rPr>
+              <w:t>401</w:t>
+            </w:r>
+          </w:p>
+        </w:tc>
+        <w:tc>
+          <w:tcPr>
+            <w:tcW w:type="dxa" w:w="3216"/>
+            <w:shd w:fill="FFFFFF"/>
+            <w:tcMar>
+              <w:top w:w="100" w:type="dxa"/>
+              <w:bottom w:w="100" w:type="dxa"/>
+              <w:left w:w="140" w:type="dxa"/>
+              <w:right w:w="140" w:type="dxa"/>
+            </w:tcMar>
+          </w:tcPr>
+          <w:p>
+            <w:r>
+              <w:rPr>
+                <w:sz w:val="19"/>
+              </w:rPr>
+              <w:t>MISSING_TOKEN</w:t>
+            </w:r>
+          </w:p>
+        </w:tc>
+        <w:tc>
+          <w:tcPr>
+            <w:tcW w:type="dxa" w:w="3216"/>
+            <w:shd w:fill="FFFFFF"/>
+            <w:tcMar>
+              <w:top w:w="100" w:type="dxa"/>
+              <w:bottom w:w="100" w:type="dxa"/>
+              <w:left w:w="140" w:type="dxa"/>
+              <w:right w:w="140" w:type="dxa"/>
+            </w:tcMar>
+          </w:tcPr>
+          <w:p>
+            <w:r>
+              <w:rPr>
+                <w:sz w:val="19"/>
+              </w:rPr>
+              <w:t>No se envió la cabecera de autenticación o el token es inválido (también INVALID_TOKEN y TOKEN_REVOKED).</w:t>
+            </w:r>
+          </w:p>
+        </w:tc>
+      </w:tr>
+      <w:tr>
+        <w:tc>
+          <w:tcPr>
+            <w:tcW w:type="dxa" w:w="3216"/>
+            <w:shd w:fill="F9FBFC"/>
+            <w:tcMar>
+              <w:top w:w="100" w:type="dxa"/>
+              <w:bottom w:w="100" w:type="dxa"/>
+              <w:left w:w="140" w:type="dxa"/>
+              <w:right w:w="140" w:type="dxa"/>
+            </w:tcMar>
+          </w:tcPr>
+          <w:p>
+            <w:r>
+              <w:rPr>
+                <w:sz w:val="19"/>
+              </w:rPr>
+              <w:t>403</w:t>
+            </w:r>
+          </w:p>
+        </w:tc>
+        <w:tc>
+          <w:tcPr>
+            <w:tcW w:type="dxa" w:w="3216"/>
+            <w:shd w:fill="F9FBFC"/>
+            <w:tcMar>
+              <w:top w:w="100" w:type="dxa"/>
+              <w:bottom w:w="100" w:type="dxa"/>
+              <w:left w:w="140" w:type="dxa"/>
+              <w:right w:w="140" w:type="dxa"/>
+            </w:tcMar>
+          </w:tcPr>
+          <w:p>
+            <w:r>
+              <w:rPr>
+                <w:sz w:val="19"/>
+              </w:rPr>
+              <w:t>INSTANCE_ACCESS_DENIED</w:t>
+            </w:r>
+          </w:p>
+        </w:tc>
+        <w:tc>
+          <w:tcPr>
+            <w:tcW w:type="dxa" w:w="3216"/>
+            <w:shd w:fill="F9FBFC"/>
+            <w:tcMar>
+              <w:top w:w="100" w:type="dxa"/>
+              <w:bottom w:w="100" w:type="dxa"/>
+              <w:left w:w="140" w:type="dxa"/>
+              <w:right w:w="140" w:type="dxa"/>
+            </w:tcMar>
+          </w:tcPr>
+          <w:p>
+            <w:r>
+              <w:rPr>
+                <w:sz w:val="19"/>
+              </w:rPr>
+              <w:t>El usuario no tiene permisos sobre esta máquina específica.</w:t>
             </w:r>
           </w:p>
         </w:tc>
@@ -2009,7 +2905,7 @@
               <w:rPr>
                 <w:sz w:val="19"/>
               </w:rPr>
-              <w:t>INSTANCE_ACCESS_DENIED</w:t>
+              <w:t>INSTANCE_PROTECTED</w:t>
             </w:r>
           </w:p>
         </w:tc>
@@ -2029,7 +2925,7 @@
               <w:rPr>
                 <w:sz w:val="19"/>
               </w:rPr>
-              <w:t>El usuario no tiene permisos sobre esta máquina específica.</w:t>
+              <w:t>La máquina es crítica para la infraestructura y está protegida contra cambios de energía y borrado.</w:t>
             </w:r>
           </w:p>
         </w:tc>
@@ -2071,7 +2967,7 @@
               <w:rPr>
                 <w:sz w:val="19"/>
               </w:rPr>
-              <w:t>INSTANCE_PROTECTED</w:t>
+              <w:t>INSUFFICIENT_PERMISSIONS</w:t>
             </w:r>
           </w:p>
         </w:tc>
@@ -2091,7 +2987,7 @@
               <w:rPr>
                 <w:sz w:val="19"/>
               </w:rPr>
-              <w:t>La máquina es crítica para la infraestructura y está protegida contra apagados.</w:t>
+              <w:t>El borrado es solo para ADMIN.</w:t>
             </w:r>
           </w:p>
         </w:tc>
@@ -2195,6 +3091,130 @@
               <w:rPr>
                 <w:sz w:val="19"/>
               </w:rPr>
+              <w:t>INSTANCE_INVALID_STATE</w:t>
+            </w:r>
+          </w:p>
+        </w:tc>
+        <w:tc>
+          <w:tcPr>
+            <w:tcW w:type="dxa" w:w="3216"/>
+            <w:shd w:fill="F9FBFC"/>
+            <w:tcMar>
+              <w:top w:w="100" w:type="dxa"/>
+              <w:bottom w:w="100" w:type="dxa"/>
+              <w:left w:w="140" w:type="dxa"/>
+              <w:right w:w="140" w:type="dxa"/>
+            </w:tcMar>
+          </w:tcPr>
+          <w:p>
+            <w:r>
+              <w:rPr>
+                <w:sz w:val="19"/>
+              </w:rPr>
+              <w:t>La máquina no está en el estado que la acción necesita (ej: encender una que ya está encendida). No se envió nada a Proxmox.</w:t>
+            </w:r>
+          </w:p>
+        </w:tc>
+      </w:tr>
+      <w:tr>
+        <w:tc>
+          <w:tcPr>
+            <w:tcW w:type="dxa" w:w="3216"/>
+            <w:shd w:fill="FFFFFF"/>
+            <w:tcMar>
+              <w:top w:w="100" w:type="dxa"/>
+              <w:bottom w:w="100" w:type="dxa"/>
+              <w:left w:w="140" w:type="dxa"/>
+              <w:right w:w="140" w:type="dxa"/>
+            </w:tcMar>
+          </w:tcPr>
+          <w:p>
+            <w:r>
+              <w:rPr>
+                <w:sz w:val="19"/>
+              </w:rPr>
+              <w:t>409</w:t>
+            </w:r>
+          </w:p>
+        </w:tc>
+        <w:tc>
+          <w:tcPr>
+            <w:tcW w:type="dxa" w:w="3216"/>
+            <w:shd w:fill="FFFFFF"/>
+            <w:tcMar>
+              <w:top w:w="100" w:type="dxa"/>
+              <w:bottom w:w="100" w:type="dxa"/>
+              <w:left w:w="140" w:type="dxa"/>
+              <w:right w:w="140" w:type="dxa"/>
+            </w:tcMar>
+          </w:tcPr>
+          <w:p>
+            <w:r>
+              <w:rPr>
+                <w:sz w:val="19"/>
+              </w:rPr>
+              <w:t>INSTANCE_NOT_STOPPED</w:t>
+            </w:r>
+          </w:p>
+        </w:tc>
+        <w:tc>
+          <w:tcPr>
+            <w:tcW w:type="dxa" w:w="3216"/>
+            <w:shd w:fill="FFFFFF"/>
+            <w:tcMar>
+              <w:top w:w="100" w:type="dxa"/>
+              <w:bottom w:w="100" w:type="dxa"/>
+              <w:left w:w="140" w:type="dxa"/>
+              <w:right w:w="140" w:type="dxa"/>
+            </w:tcMar>
+          </w:tcPr>
+          <w:p>
+            <w:r>
+              <w:rPr>
+                <w:sz w:val="19"/>
+              </w:rPr>
+              <w:t>Se pidió borrar una máquina que no está apagada. Hay que apagarla primero.</w:t>
+            </w:r>
+          </w:p>
+        </w:tc>
+      </w:tr>
+      <w:tr>
+        <w:tc>
+          <w:tcPr>
+            <w:tcW w:type="dxa" w:w="3216"/>
+            <w:shd w:fill="F9FBFC"/>
+            <w:tcMar>
+              <w:top w:w="100" w:type="dxa"/>
+              <w:bottom w:w="100" w:type="dxa"/>
+              <w:left w:w="140" w:type="dxa"/>
+              <w:right w:w="140" w:type="dxa"/>
+            </w:tcMar>
+          </w:tcPr>
+          <w:p>
+            <w:r>
+              <w:rPr>
+                <w:sz w:val="19"/>
+              </w:rPr>
+              <w:t>409</w:t>
+            </w:r>
+          </w:p>
+        </w:tc>
+        <w:tc>
+          <w:tcPr>
+            <w:tcW w:type="dxa" w:w="3216"/>
+            <w:shd w:fill="F9FBFC"/>
+            <w:tcMar>
+              <w:top w:w="100" w:type="dxa"/>
+              <w:bottom w:w="100" w:type="dxa"/>
+              <w:left w:w="140" w:type="dxa"/>
+              <w:right w:w="140" w:type="dxa"/>
+            </w:tcMar>
+          </w:tcPr>
+          <w:p>
+            <w:r>
+              <w:rPr>
+                <w:sz w:val="19"/>
+              </w:rPr>
               <w:t>INSTANCE_BUSY</w:t>
             </w:r>
           </w:p>
@@ -2215,7 +3235,7 @@
               <w:rPr>
                 <w:sz w:val="19"/>
               </w:rPr>
-              <w:t>La máquina ya está ejecutando otra operación (ej: ya se está prendiendo).</w:t>
+              <w:t>La máquina ya está ejecutando otra operación (ej: ya se está prendiendo). Reintentar cuando llegue su TASK_FINISHED.</w:t>
             </w:r>
           </w:p>
         </w:tc>
@@ -2432,7 +3452,7 @@
         <w:spacing w:before="0" w:after="120" w:line="276" w:lineRule="auto"/>
       </w:pPr>
       <w:r>
-        <w:t>El sistema utiliza Server-Sent Events (SSE). Permite que la pantalla del usuario se actualice sola apenas una máquina virtual termina de arrancar o apagarse, sin necesidad de que el usuario recargue la página.</w:t>
+        <w:t>El sistema utiliza Server-Sent Events (SSE). Permite que la pantalla del usuario se actualice sola apenas una máquina virtual termina de arrancar, apagarse o borrarse, sin necesidad de que el usuario recargue la página.</w:t>
       </w:r>
     </w:p>
     <w:p>
@@ -2515,7 +3535,7 @@
     </w:tbl>
     <w:p>
       <w:pPr>
-        <w:spacing w:after="80"/>
+        <w:spacing w:after="120"/>
       </w:pPr>
     </w:p>
     <w:p>
@@ -2588,7 +3608,7 @@
     </w:tbl>
     <w:p>
       <w:pPr>
-        <w:spacing w:after="80"/>
+        <w:spacing w:after="120"/>
       </w:pPr>
     </w:p>
     <w:p>
@@ -2673,9 +3693,15 @@
               <w:br/>
               <w:t xml:space="preserve">    "tareaId": "3f2504e0-4f89-11d3-9a0c-0305e82c3301",</w:t>
               <w:br/>
+              <w:t xml:space="preserve">    "accion": "START",</w:t>
+              <w:br/>
               <w:t xml:space="preserve">    "estado": "COMPLETED",</w:t>
               <w:br/>
-              <w:t xml:space="preserve">    "accion": "start"</w:t>
+              <w:t xml:space="preserve">    "exitstatus": "OK",</w:t>
+              <w:br/>
+              <w:t xml:space="preserve">    "motivo": null,</w:t>
+              <w:br/>
+              <w:t xml:space="preserve">    "error": null</w:t>
               <w:br/>
               <w:t xml:space="preserve">  }</w:t>
               <w:br/>
@@ -2687,7 +3713,775 @@
     </w:tbl>
     <w:p>
       <w:pPr>
-        <w:spacing w:after="80"/>
+        <w:spacing w:after="120"/>
+      </w:pPr>
+    </w:p>
+    <w:p>
+      <w:pPr>
+        <w:spacing w:before="0" w:after="120" w:line="276" w:lineRule="auto"/>
+      </w:pPr>
+      <w:r>
+        <w:rPr>
+          <w:b/>
+        </w:rPr>
+        <w:t xml:space="preserve">Campos de detalles: </w:t>
+      </w:r>
+      <w:r>
+        <w:t>En un TASK_FINISHED, detalles trae siempre estas seis claves; las que no aplican llegan en null (nunca se omiten):</w:t>
+      </w:r>
+    </w:p>
+    <w:tbl>
+      <w:tblPr>
+        <w:tblW w:type="auto" w:w="0"/>
+        <w:jc w:val="center"/>
+        <w:tblLook w:firstColumn="1" w:firstRow="1" w:lastColumn="0" w:lastRow="0" w:noHBand="0" w:noVBand="1" w:val="04A0"/>
+      </w:tblPr>
+      <w:tblGrid>
+        <w:gridCol w:w="3216"/>
+        <w:gridCol w:w="3216"/>
+        <w:gridCol w:w="3216"/>
+      </w:tblGrid>
+      <w:tr>
+        <w:tc>
+          <w:tcPr>
+            <w:tcW w:type="dxa" w:w="3216"/>
+            <w:shd w:fill="0F4C81"/>
+            <w:tcMar>
+              <w:top w:w="120" w:type="dxa"/>
+              <w:bottom w:w="120" w:type="dxa"/>
+              <w:left w:w="140" w:type="dxa"/>
+              <w:right w:w="140" w:type="dxa"/>
+            </w:tcMar>
+          </w:tcPr>
+          <w:p>
+            <w:pPr>
+              <w:jc w:val="left"/>
+            </w:pPr>
+            <w:r>
+              <w:rPr>
+                <w:b/>
+                <w:color w:val="FFFFFF"/>
+                <w:sz w:val="20"/>
+              </w:rPr>
+              <w:t>Campo</w:t>
+            </w:r>
+          </w:p>
+        </w:tc>
+        <w:tc>
+          <w:tcPr>
+            <w:tcW w:type="dxa" w:w="3216"/>
+            <w:shd w:fill="0F4C81"/>
+            <w:tcMar>
+              <w:top w:w="120" w:type="dxa"/>
+              <w:bottom w:w="120" w:type="dxa"/>
+              <w:left w:w="140" w:type="dxa"/>
+              <w:right w:w="140" w:type="dxa"/>
+            </w:tcMar>
+          </w:tcPr>
+          <w:p>
+            <w:pPr>
+              <w:jc w:val="left"/>
+            </w:pPr>
+            <w:r>
+              <w:rPr>
+                <w:b/>
+                <w:color w:val="FFFFFF"/>
+                <w:sz w:val="20"/>
+              </w:rPr>
+              <w:t>Tipo de Dato</w:t>
+            </w:r>
+          </w:p>
+        </w:tc>
+        <w:tc>
+          <w:tcPr>
+            <w:tcW w:type="dxa" w:w="3216"/>
+            <w:shd w:fill="0F4C81"/>
+            <w:tcMar>
+              <w:top w:w="120" w:type="dxa"/>
+              <w:bottom w:w="120" w:type="dxa"/>
+              <w:left w:w="140" w:type="dxa"/>
+              <w:right w:w="140" w:type="dxa"/>
+            </w:tcMar>
+          </w:tcPr>
+          <w:p>
+            <w:pPr>
+              <w:jc w:val="left"/>
+            </w:pPr>
+            <w:r>
+              <w:rPr>
+                <w:b/>
+                <w:color w:val="FFFFFF"/>
+                <w:sz w:val="20"/>
+              </w:rPr>
+              <w:t>Significado / Regla</w:t>
+            </w:r>
+          </w:p>
+        </w:tc>
+      </w:tr>
+      <w:tr>
+        <w:tc>
+          <w:tcPr>
+            <w:tcW w:type="dxa" w:w="3216"/>
+            <w:shd w:fill="FFFFFF"/>
+            <w:tcMar>
+              <w:top w:w="100" w:type="dxa"/>
+              <w:bottom w:w="100" w:type="dxa"/>
+              <w:left w:w="140" w:type="dxa"/>
+              <w:right w:w="140" w:type="dxa"/>
+            </w:tcMar>
+          </w:tcPr>
+          <w:p>
+            <w:r>
+              <w:rPr>
+                <w:sz w:val="19"/>
+              </w:rPr>
+              <w:t>tareaId</w:t>
+            </w:r>
+          </w:p>
+        </w:tc>
+        <w:tc>
+          <w:tcPr>
+            <w:tcW w:type="dxa" w:w="3216"/>
+            <w:shd w:fill="FFFFFF"/>
+            <w:tcMar>
+              <w:top w:w="100" w:type="dxa"/>
+              <w:bottom w:w="100" w:type="dxa"/>
+              <w:left w:w="140" w:type="dxa"/>
+              <w:right w:w="140" w:type="dxa"/>
+            </w:tcMar>
+          </w:tcPr>
+          <w:p>
+            <w:r>
+              <w:rPr>
+                <w:sz w:val="19"/>
+              </w:rPr>
+              <w:t>Texto (UUID)</w:t>
+            </w:r>
+          </w:p>
+        </w:tc>
+        <w:tc>
+          <w:tcPr>
+            <w:tcW w:type="dxa" w:w="3216"/>
+            <w:shd w:fill="FFFFFF"/>
+            <w:tcMar>
+              <w:top w:w="100" w:type="dxa"/>
+              <w:bottom w:w="100" w:type="dxa"/>
+              <w:left w:w="140" w:type="dxa"/>
+              <w:right w:w="140" w:type="dxa"/>
+            </w:tcMar>
+          </w:tcPr>
+          <w:p>
+            <w:r>
+              <w:rPr>
+                <w:sz w:val="19"/>
+              </w:rPr>
+              <w:t>El tareaId del 202, para saber a qué acción corresponde.</w:t>
+            </w:r>
+          </w:p>
+        </w:tc>
+      </w:tr>
+      <w:tr>
+        <w:tc>
+          <w:tcPr>
+            <w:tcW w:type="dxa" w:w="3216"/>
+            <w:shd w:fill="F9FBFC"/>
+            <w:tcMar>
+              <w:top w:w="100" w:type="dxa"/>
+              <w:bottom w:w="100" w:type="dxa"/>
+              <w:left w:w="140" w:type="dxa"/>
+              <w:right w:w="140" w:type="dxa"/>
+            </w:tcMar>
+          </w:tcPr>
+          <w:p>
+            <w:r>
+              <w:rPr>
+                <w:sz w:val="19"/>
+              </w:rPr>
+              <w:t>accion</w:t>
+            </w:r>
+          </w:p>
+        </w:tc>
+        <w:tc>
+          <w:tcPr>
+            <w:tcW w:type="dxa" w:w="3216"/>
+            <w:shd w:fill="F9FBFC"/>
+            <w:tcMar>
+              <w:top w:w="100" w:type="dxa"/>
+              <w:bottom w:w="100" w:type="dxa"/>
+              <w:left w:w="140" w:type="dxa"/>
+              <w:right w:w="140" w:type="dxa"/>
+            </w:tcMar>
+          </w:tcPr>
+          <w:p>
+            <w:r>
+              <w:rPr>
+                <w:sz w:val="19"/>
+              </w:rPr>
+              <w:t>Texto</w:t>
+            </w:r>
+          </w:p>
+        </w:tc>
+        <w:tc>
+          <w:tcPr>
+            <w:tcW w:type="dxa" w:w="3216"/>
+            <w:shd w:fill="F9FBFC"/>
+            <w:tcMar>
+              <w:top w:w="100" w:type="dxa"/>
+              <w:bottom w:w="100" w:type="dxa"/>
+              <w:left w:w="140" w:type="dxa"/>
+              <w:right w:w="140" w:type="dxa"/>
+            </w:tcMar>
+          </w:tcPr>
+          <w:p>
+            <w:r>
+              <w:rPr>
+                <w:sz w:val="19"/>
+              </w:rPr>
+              <w:t>START, STOP, SHUTDOWN, REBOOT o DELETE.</w:t>
+            </w:r>
+          </w:p>
+        </w:tc>
+      </w:tr>
+      <w:tr>
+        <w:tc>
+          <w:tcPr>
+            <w:tcW w:type="dxa" w:w="3216"/>
+            <w:shd w:fill="FFFFFF"/>
+            <w:tcMar>
+              <w:top w:w="100" w:type="dxa"/>
+              <w:bottom w:w="100" w:type="dxa"/>
+              <w:left w:w="140" w:type="dxa"/>
+              <w:right w:w="140" w:type="dxa"/>
+            </w:tcMar>
+          </w:tcPr>
+          <w:p>
+            <w:r>
+              <w:rPr>
+                <w:sz w:val="19"/>
+              </w:rPr>
+              <w:t>estado</w:t>
+            </w:r>
+          </w:p>
+        </w:tc>
+        <w:tc>
+          <w:tcPr>
+            <w:tcW w:type="dxa" w:w="3216"/>
+            <w:shd w:fill="FFFFFF"/>
+            <w:tcMar>
+              <w:top w:w="100" w:type="dxa"/>
+              <w:bottom w:w="100" w:type="dxa"/>
+              <w:left w:w="140" w:type="dxa"/>
+              <w:right w:w="140" w:type="dxa"/>
+            </w:tcMar>
+          </w:tcPr>
+          <w:p>
+            <w:r>
+              <w:rPr>
+                <w:sz w:val="19"/>
+              </w:rPr>
+              <w:t>Texto</w:t>
+            </w:r>
+          </w:p>
+        </w:tc>
+        <w:tc>
+          <w:tcPr>
+            <w:tcW w:type="dxa" w:w="3216"/>
+            <w:shd w:fill="FFFFFF"/>
+            <w:tcMar>
+              <w:top w:w="100" w:type="dxa"/>
+              <w:bottom w:w="100" w:type="dxa"/>
+              <w:left w:w="140" w:type="dxa"/>
+              <w:right w:w="140" w:type="dxa"/>
+            </w:tcMar>
+          </w:tcPr>
+          <w:p>
+            <w:r>
+              <w:rPr>
+                <w:sz w:val="19"/>
+              </w:rPr>
+              <w:t>COMPLETED (terminó bien) o FAILED (falló).</w:t>
+            </w:r>
+          </w:p>
+        </w:tc>
+      </w:tr>
+      <w:tr>
+        <w:tc>
+          <w:tcPr>
+            <w:tcW w:type="dxa" w:w="3216"/>
+            <w:shd w:fill="F9FBFC"/>
+            <w:tcMar>
+              <w:top w:w="100" w:type="dxa"/>
+              <w:bottom w:w="100" w:type="dxa"/>
+              <w:left w:w="140" w:type="dxa"/>
+              <w:right w:w="140" w:type="dxa"/>
+            </w:tcMar>
+          </w:tcPr>
+          <w:p>
+            <w:r>
+              <w:rPr>
+                <w:sz w:val="19"/>
+              </w:rPr>
+              <w:t>exitstatus</w:t>
+            </w:r>
+          </w:p>
+        </w:tc>
+        <w:tc>
+          <w:tcPr>
+            <w:tcW w:type="dxa" w:w="3216"/>
+            <w:shd w:fill="F9FBFC"/>
+            <w:tcMar>
+              <w:top w:w="100" w:type="dxa"/>
+              <w:bottom w:w="100" w:type="dxa"/>
+              <w:left w:w="140" w:type="dxa"/>
+              <w:right w:w="140" w:type="dxa"/>
+            </w:tcMar>
+          </w:tcPr>
+          <w:p>
+            <w:r>
+              <w:rPr>
+                <w:sz w:val="19"/>
+              </w:rPr>
+              <w:t>Texto o null</w:t>
+            </w:r>
+          </w:p>
+        </w:tc>
+        <w:tc>
+          <w:tcPr>
+            <w:tcW w:type="dxa" w:w="3216"/>
+            <w:shd w:fill="F9FBFC"/>
+            <w:tcMar>
+              <w:top w:w="100" w:type="dxa"/>
+              <w:bottom w:w="100" w:type="dxa"/>
+              <w:left w:w="140" w:type="dxa"/>
+              <w:right w:w="140" w:type="dxa"/>
+            </w:tcMar>
+          </w:tcPr>
+          <w:p>
+            <w:r>
+              <w:rPr>
+                <w:sz w:val="19"/>
+              </w:rPr>
+              <w:t>Lo que informó Proxmox al terminar ('OK' si salió bien). null si Proxmox nunca la dio por terminada.</w:t>
+            </w:r>
+          </w:p>
+        </w:tc>
+      </w:tr>
+      <w:tr>
+        <w:tc>
+          <w:tcPr>
+            <w:tcW w:type="dxa" w:w="3216"/>
+            <w:shd w:fill="FFFFFF"/>
+            <w:tcMar>
+              <w:top w:w="100" w:type="dxa"/>
+              <w:bottom w:w="100" w:type="dxa"/>
+              <w:left w:w="140" w:type="dxa"/>
+              <w:right w:w="140" w:type="dxa"/>
+            </w:tcMar>
+          </w:tcPr>
+          <w:p>
+            <w:r>
+              <w:rPr>
+                <w:sz w:val="19"/>
+              </w:rPr>
+              <w:t>motivo</w:t>
+            </w:r>
+          </w:p>
+        </w:tc>
+        <w:tc>
+          <w:tcPr>
+            <w:tcW w:type="dxa" w:w="3216"/>
+            <w:shd w:fill="FFFFFF"/>
+            <w:tcMar>
+              <w:top w:w="100" w:type="dxa"/>
+              <w:bottom w:w="100" w:type="dxa"/>
+              <w:left w:w="140" w:type="dxa"/>
+              <w:right w:w="140" w:type="dxa"/>
+            </w:tcMar>
+          </w:tcPr>
+          <w:p>
+            <w:r>
+              <w:rPr>
+                <w:sz w:val="19"/>
+              </w:rPr>
+              <w:t>Texto o null</w:t>
+            </w:r>
+          </w:p>
+        </w:tc>
+        <w:tc>
+          <w:tcPr>
+            <w:tcW w:type="dxa" w:w="3216"/>
+            <w:shd w:fill="FFFFFF"/>
+            <w:tcMar>
+              <w:top w:w="100" w:type="dxa"/>
+              <w:bottom w:w="100" w:type="dxa"/>
+              <w:left w:w="140" w:type="dxa"/>
+              <w:right w:w="140" w:type="dxa"/>
+            </w:tcMar>
+          </w:tcPr>
+          <w:p>
+            <w:r>
+              <w:rPr>
+                <w:sz w:val="19"/>
+              </w:rPr>
+              <w:t>null salvo que estado sea FAILED. Entonces vale PROXMOX_ERROR o TIMEOUT.</w:t>
+            </w:r>
+          </w:p>
+        </w:tc>
+      </w:tr>
+      <w:tr>
+        <w:tc>
+          <w:tcPr>
+            <w:tcW w:type="dxa" w:w="3216"/>
+            <w:shd w:fill="F9FBFC"/>
+            <w:tcMar>
+              <w:top w:w="100" w:type="dxa"/>
+              <w:bottom w:w="100" w:type="dxa"/>
+              <w:left w:w="140" w:type="dxa"/>
+              <w:right w:w="140" w:type="dxa"/>
+            </w:tcMar>
+          </w:tcPr>
+          <w:p>
+            <w:r>
+              <w:rPr>
+                <w:sz w:val="19"/>
+              </w:rPr>
+              <w:t>error</w:t>
+            </w:r>
+          </w:p>
+        </w:tc>
+        <w:tc>
+          <w:tcPr>
+            <w:tcW w:type="dxa" w:w="3216"/>
+            <w:shd w:fill="F9FBFC"/>
+            <w:tcMar>
+              <w:top w:w="100" w:type="dxa"/>
+              <w:bottom w:w="100" w:type="dxa"/>
+              <w:left w:w="140" w:type="dxa"/>
+              <w:right w:w="140" w:type="dxa"/>
+            </w:tcMar>
+          </w:tcPr>
+          <w:p>
+            <w:r>
+              <w:rPr>
+                <w:sz w:val="19"/>
+              </w:rPr>
+              <w:t>Texto o null</w:t>
+            </w:r>
+          </w:p>
+        </w:tc>
+        <w:tc>
+          <w:tcPr>
+            <w:tcW w:type="dxa" w:w="3216"/>
+            <w:shd w:fill="F9FBFC"/>
+            <w:tcMar>
+              <w:top w:w="100" w:type="dxa"/>
+              <w:bottom w:w="100" w:type="dxa"/>
+              <w:left w:w="140" w:type="dxa"/>
+              <w:right w:w="140" w:type="dxa"/>
+            </w:tcMar>
+          </w:tcPr>
+          <w:p>
+            <w:r>
+              <w:rPr>
+                <w:sz w:val="19"/>
+              </w:rPr>
+              <w:t>null salvo que estado sea FAILED. Entonces explica qué pasó.</w:t>
+            </w:r>
+          </w:p>
+        </w:tc>
+      </w:tr>
+    </w:tbl>
+    <w:p>
+      <w:pPr>
+        <w:spacing w:after="120"/>
+      </w:pPr>
+    </w:p>
+    <w:p>
+      <w:pPr>
+        <w:spacing w:before="0" w:after="120" w:line="276" w:lineRule="auto"/>
+      </w:pPr>
+      <w:r>
+        <w:rPr>
+          <w:b/>
+        </w:rPr>
+        <w:t xml:space="preserve">Cuando estado es FAILED: </w:t>
+      </w:r>
+      <w:r>
+        <w:t>Los dos motivos de una tarea fallida (severidad WARNING):</w:t>
+      </w:r>
+    </w:p>
+    <w:tbl>
+      <w:tblPr>
+        <w:tblW w:type="auto" w:w="0"/>
+        <w:jc w:val="center"/>
+        <w:tblLook w:firstColumn="1" w:firstRow="1" w:lastColumn="0" w:lastRow="0" w:noHBand="0" w:noVBand="1" w:val="04A0"/>
+      </w:tblPr>
+      <w:tblGrid>
+        <w:gridCol w:w="3216"/>
+        <w:gridCol w:w="3216"/>
+        <w:gridCol w:w="3216"/>
+      </w:tblGrid>
+      <w:tr>
+        <w:tc>
+          <w:tcPr>
+            <w:tcW w:type="dxa" w:w="3216"/>
+            <w:shd w:fill="0F4C81"/>
+            <w:tcMar>
+              <w:top w:w="120" w:type="dxa"/>
+              <w:bottom w:w="120" w:type="dxa"/>
+              <w:left w:w="140" w:type="dxa"/>
+              <w:right w:w="140" w:type="dxa"/>
+            </w:tcMar>
+          </w:tcPr>
+          <w:p>
+            <w:pPr>
+              <w:jc w:val="left"/>
+            </w:pPr>
+            <w:r>
+              <w:rPr>
+                <w:b/>
+                <w:color w:val="FFFFFF"/>
+                <w:sz w:val="20"/>
+              </w:rPr>
+              <w:t>motivo</w:t>
+            </w:r>
+          </w:p>
+        </w:tc>
+        <w:tc>
+          <w:tcPr>
+            <w:tcW w:type="dxa" w:w="3216"/>
+            <w:shd w:fill="0F4C81"/>
+            <w:tcMar>
+              <w:top w:w="120" w:type="dxa"/>
+              <w:bottom w:w="120" w:type="dxa"/>
+              <w:left w:w="140" w:type="dxa"/>
+              <w:right w:w="140" w:type="dxa"/>
+            </w:tcMar>
+          </w:tcPr>
+          <w:p>
+            <w:pPr>
+              <w:jc w:val="left"/>
+            </w:pPr>
+            <w:r>
+              <w:rPr>
+                <w:b/>
+                <w:color w:val="FFFFFF"/>
+                <w:sz w:val="20"/>
+              </w:rPr>
+              <w:t>Cuándo</w:t>
+            </w:r>
+          </w:p>
+        </w:tc>
+        <w:tc>
+          <w:tcPr>
+            <w:tcW w:type="dxa" w:w="3216"/>
+            <w:shd w:fill="0F4C81"/>
+            <w:tcMar>
+              <w:top w:w="120" w:type="dxa"/>
+              <w:bottom w:w="120" w:type="dxa"/>
+              <w:left w:w="140" w:type="dxa"/>
+              <w:right w:w="140" w:type="dxa"/>
+            </w:tcMar>
+          </w:tcPr>
+          <w:p>
+            <w:pPr>
+              <w:jc w:val="left"/>
+            </w:pPr>
+            <w:r>
+              <w:rPr>
+                <w:b/>
+                <w:color w:val="FFFFFF"/>
+                <w:sz w:val="20"/>
+              </w:rPr>
+              <w:t>exitstatus y error</w:t>
+            </w:r>
+          </w:p>
+        </w:tc>
+      </w:tr>
+      <w:tr>
+        <w:tc>
+          <w:tcPr>
+            <w:tcW w:type="dxa" w:w="3216"/>
+            <w:shd w:fill="FFFFFF"/>
+            <w:tcMar>
+              <w:top w:w="100" w:type="dxa"/>
+              <w:bottom w:w="100" w:type="dxa"/>
+              <w:left w:w="140" w:type="dxa"/>
+              <w:right w:w="140" w:type="dxa"/>
+            </w:tcMar>
+          </w:tcPr>
+          <w:p>
+            <w:r>
+              <w:rPr>
+                <w:sz w:val="19"/>
+              </w:rPr>
+              <w:t>PROXMOX_ERROR</w:t>
+            </w:r>
+          </w:p>
+        </w:tc>
+        <w:tc>
+          <w:tcPr>
+            <w:tcW w:type="dxa" w:w="3216"/>
+            <w:shd w:fill="FFFFFF"/>
+            <w:tcMar>
+              <w:top w:w="100" w:type="dxa"/>
+              <w:bottom w:w="100" w:type="dxa"/>
+              <w:left w:w="140" w:type="dxa"/>
+              <w:right w:w="140" w:type="dxa"/>
+            </w:tcMar>
+          </w:tcPr>
+          <w:p>
+            <w:r>
+              <w:rPr>
+                <w:sz w:val="19"/>
+              </w:rPr>
+              <w:t>Proxmox terminó la tarea con error.</w:t>
+            </w:r>
+          </w:p>
+        </w:tc>
+        <w:tc>
+          <w:tcPr>
+            <w:tcW w:type="dxa" w:w="3216"/>
+            <w:shd w:fill="FFFFFF"/>
+            <w:tcMar>
+              <w:top w:w="100" w:type="dxa"/>
+              <w:bottom w:w="100" w:type="dxa"/>
+              <w:left w:w="140" w:type="dxa"/>
+              <w:right w:w="140" w:type="dxa"/>
+            </w:tcMar>
+          </w:tcPr>
+          <w:p>
+            <w:r>
+              <w:rPr>
+                <w:sz w:val="19"/>
+              </w:rPr>
+              <w:t>Los dos traen el texto de Proxmox.</w:t>
+            </w:r>
+          </w:p>
+        </w:tc>
+      </w:tr>
+      <w:tr>
+        <w:tc>
+          <w:tcPr>
+            <w:tcW w:type="dxa" w:w="3216"/>
+            <w:shd w:fill="F9FBFC"/>
+            <w:tcMar>
+              <w:top w:w="100" w:type="dxa"/>
+              <w:bottom w:w="100" w:type="dxa"/>
+              <w:left w:w="140" w:type="dxa"/>
+              <w:right w:w="140" w:type="dxa"/>
+            </w:tcMar>
+          </w:tcPr>
+          <w:p>
+            <w:r>
+              <w:rPr>
+                <w:sz w:val="19"/>
+              </w:rPr>
+              <w:t>TIMEOUT</w:t>
+            </w:r>
+          </w:p>
+        </w:tc>
+        <w:tc>
+          <w:tcPr>
+            <w:tcW w:type="dxa" w:w="3216"/>
+            <w:shd w:fill="F9FBFC"/>
+            <w:tcMar>
+              <w:top w:w="100" w:type="dxa"/>
+              <w:bottom w:w="100" w:type="dxa"/>
+              <w:left w:w="140" w:type="dxa"/>
+              <w:right w:w="140" w:type="dxa"/>
+            </w:tcMar>
+          </w:tcPr>
+          <w:p>
+            <w:r>
+              <w:rPr>
+                <w:sz w:val="19"/>
+              </w:rPr>
+              <w:t>Proxmox no la dio por terminada en 10 minutos.</w:t>
+            </w:r>
+          </w:p>
+        </w:tc>
+        <w:tc>
+          <w:tcPr>
+            <w:tcW w:type="dxa" w:w="3216"/>
+            <w:shd w:fill="F9FBFC"/>
+            <w:tcMar>
+              <w:top w:w="100" w:type="dxa"/>
+              <w:bottom w:w="100" w:type="dxa"/>
+              <w:left w:w="140" w:type="dxa"/>
+              <w:right w:w="140" w:type="dxa"/>
+            </w:tcMar>
+          </w:tcPr>
+          <w:p>
+            <w:r>
+              <w:rPr>
+                <w:sz w:val="19"/>
+              </w:rPr>
+              <w:t>exitstatus es null; error lo explica.</w:t>
+            </w:r>
+          </w:p>
+        </w:tc>
+      </w:tr>
+    </w:tbl>
+    <w:p>
+      <w:pPr>
+        <w:spacing w:after="120"/>
+      </w:pPr>
+    </w:p>
+    <w:tbl>
+      <w:tblPr>
+        <w:tblW w:type="auto" w:w="0"/>
+        <w:jc w:val="center"/>
+        <w:tblLook w:firstColumn="1" w:firstRow="1" w:lastColumn="0" w:lastRow="0" w:noHBand="0" w:noVBand="1" w:val="04A0"/>
+      </w:tblPr>
+      <w:tblGrid>
+        <w:gridCol w:w="9648"/>
+      </w:tblGrid>
+      <w:tr>
+        <w:tc>
+          <w:tcPr>
+            <w:tcW w:type="dxa" w:w="9648"/>
+            <w:shd w:fill="F8F9FA"/>
+            <w:tcMar>
+              <w:top w:w="120" w:type="dxa"/>
+              <w:bottom w:w="120" w:type="dxa"/>
+              <w:left w:w="180" w:type="dxa"/>
+              <w:right w:w="180" w:type="dxa"/>
+            </w:tcMar>
+          </w:tcPr>
+          <w:p>
+            <w:pPr>
+              <w:spacing w:before="0" w:after="0"/>
+            </w:pPr>
+            <w:r>
+              <w:rPr>
+                <w:rFonts w:ascii="Consolas" w:hAnsi="Consolas"/>
+                <w:color w:val="24292E"/>
+                <w:sz w:val="19"/>
+              </w:rPr>
+              <w:t>{</w:t>
+              <w:br/>
+              <w:t xml:space="preserve">  "tareaId": "3f2504e0-4f89-11d3-9a0c-0305e82c3302",</w:t>
+              <w:br/>
+              <w:t xml:space="preserve">  "accion": "STOP",</w:t>
+              <w:br/>
+              <w:t xml:space="preserve">  "estado": "FAILED",</w:t>
+              <w:br/>
+              <w:t xml:space="preserve">  "exitstatus": "CT 201 not running",</w:t>
+              <w:br/>
+              <w:t xml:space="preserve">  "motivo": "PROXMOX_ERROR",</w:t>
+              <w:br/>
+              <w:t xml:space="preserve">  "error": "CT 201 not running"</w:t>
+              <w:br/>
+              <w:t>}</w:t>
+            </w:r>
+          </w:p>
+        </w:tc>
+      </w:tr>
+    </w:tbl>
+    <w:p>
+      <w:pPr>
+        <w:spacing w:after="120"/>
       </w:pPr>
     </w:p>
     <w:p>
@@ -2702,7 +4496,7 @@
           <w:color w:val="0F4C81"/>
           <w:sz w:val="28"/>
         </w:rPr>
-        <w:t>6. Estado General del Servidor Físico (Nodo) — Planificado</w:t>
+        <w:t>6. Estado General del Servidor Físico (Nodo) — Operativo</w:t>
       </w:r>
     </w:p>
     <w:p>
@@ -2710,8 +4504,128 @@
         <w:spacing w:before="0" w:after="120" w:line="276" w:lineRule="auto"/>
       </w:pPr>
       <w:r>
-        <w:t>La consulta GET /api/node/status devolverá el estado global del hardware (CPU, memoria, almacenamiento y cantidad de máquinas encendidas).</w:t>
+        <w:t>La consulta GET /api/node/status devuelve el estado global del hardware: CPU, memoria, almacenamiento, tiempo encendido y cantidad de máquinas y contenedores encendidos, apagados y pausados.</w:t>
       </w:r>
+    </w:p>
+    <w:p>
+      <w:pPr>
+        <w:spacing w:before="0" w:after="120" w:line="276" w:lineRule="auto"/>
+      </w:pPr>
+      <w:r>
+        <w:rPr>
+          <w:b/>
+        </w:rPr>
+        <w:t xml:space="preserve">Quién puede usarlo (D1): </w:t>
+      </w:r>
+      <w:r>
+        <w:t>Cualquier usuario autenticado, ADMIN u OPERATOR, puede consultarlo. No se filtra por permisos de instancia: un OPERATOR ve los totales de todo el nodo.</w:t>
+      </w:r>
+    </w:p>
+    <w:tbl>
+      <w:tblPr>
+        <w:tblW w:type="auto" w:w="0"/>
+        <w:jc w:val="center"/>
+        <w:tblLook w:firstColumn="1" w:firstRow="1" w:lastColumn="0" w:lastRow="0" w:noHBand="0" w:noVBand="1" w:val="04A0"/>
+      </w:tblPr>
+      <w:tblGrid>
+        <w:gridCol w:w="9648"/>
+      </w:tblGrid>
+      <w:tr>
+        <w:tc>
+          <w:tcPr>
+            <w:tcW w:type="dxa" w:w="9648"/>
+            <w:shd w:fill="F8F9FA"/>
+            <w:tcMar>
+              <w:top w:w="120" w:type="dxa"/>
+              <w:bottom w:w="120" w:type="dxa"/>
+              <w:left w:w="180" w:type="dxa"/>
+              <w:right w:w="180" w:type="dxa"/>
+            </w:tcMar>
+          </w:tcPr>
+          <w:p>
+            <w:pPr>
+              <w:spacing w:before="0" w:after="0"/>
+            </w:pPr>
+            <w:r>
+              <w:rPr>
+                <w:rFonts w:ascii="Consolas" w:hAnsi="Consolas"/>
+                <w:color w:val="24292E"/>
+                <w:sz w:val="19"/>
+              </w:rPr>
+              <w:t>{</w:t>
+              <w:br/>
+              <w:t xml:space="preserve">  "cpu": {</w:t>
+              <w:br/>
+              <w:t xml:space="preserve">    "usagePercent": 37.5,</w:t>
+              <w:br/>
+              <w:t xml:space="preserve">    "cores": 16</w:t>
+              <w:br/>
+              <w:t xml:space="preserve">  },</w:t>
+              <w:br/>
+              <w:t xml:space="preserve">  "ram": {</w:t>
+              <w:br/>
+              <w:t xml:space="preserve">    "usedGb": 42.25,</w:t>
+              <w:br/>
+              <w:t xml:space="preserve">    "totalGb": 128,</w:t>
+              <w:br/>
+              <w:t xml:space="preserve">    "usagePercent": 33.01</w:t>
+              <w:br/>
+              <w:t xml:space="preserve">  },</w:t>
+              <w:br/>
+              <w:t xml:space="preserve">  "storage": {</w:t>
+              <w:br/>
+              <w:t xml:space="preserve">    "usedGb": 380,</w:t>
+              <w:br/>
+              <w:t xml:space="preserve">    "totalGb": 1024,</w:t>
+              <w:br/>
+              <w:t xml:space="preserve">    "usagePercent": 37.11</w:t>
+              <w:br/>
+              <w:t xml:space="preserve">  },</w:t>
+              <w:br/>
+              <w:t xml:space="preserve">  "uptimeSeconds": 86400,</w:t>
+              <w:br/>
+              <w:t xml:space="preserve">  "instancesSummary": {</w:t>
+              <w:br/>
+              <w:t xml:space="preserve">    "vms": {</w:t>
+              <w:br/>
+              <w:t xml:space="preserve">      "running": 6,</w:t>
+              <w:br/>
+              <w:t xml:space="preserve">      "stopped": 2,</w:t>
+              <w:br/>
+              <w:t xml:space="preserve">      "paused": 1,</w:t>
+              <w:br/>
+              <w:t xml:space="preserve">      "total": 9</w:t>
+              <w:br/>
+              <w:t xml:space="preserve">    },</w:t>
+              <w:br/>
+              <w:t xml:space="preserve">    "lxc": {</w:t>
+              <w:br/>
+              <w:t xml:space="preserve">      "running": 3,</w:t>
+              <w:br/>
+              <w:t xml:space="preserve">      "stopped": 1,</w:t>
+              <w:br/>
+              <w:t xml:space="preserve">      "paused": 0,</w:t>
+              <w:br/>
+              <w:t xml:space="preserve">      "total": 4</w:t>
+              <w:br/>
+              <w:t xml:space="preserve">    }</w:t>
+              <w:br/>
+              <w:t xml:space="preserve">  },</w:t>
+              <w:br/>
+              <w:t xml:space="preserve">  "stale": false,</w:t>
+              <w:br/>
+              <w:t xml:space="preserve">  "fetchedAt": "2026-10-03T14:30:05Z"</w:t>
+              <w:br/>
+              <w:t>}</w:t>
+            </w:r>
+          </w:p>
+        </w:tc>
+      </w:tr>
+    </w:tbl>
+    <w:p>
+      <w:pPr>
+        <w:spacing w:after="120"/>
+      </w:pPr>
     </w:p>
     <w:tbl>
       <w:tblPr>
@@ -2743,18 +4657,23 @@
                 <w:b/>
                 <w:color w:val="0F4C81"/>
               </w:rPr>
-              <w:t xml:space="preserve">📌 Aviso de desarrollo: </w:t>
+              <w:t xml:space="preserve">📌 Lecturas guardadas (stale): </w:t>
             </w:r>
             <w:r>
               <w:rPr>
                 <w:sz w:val="20"/>
               </w:rPr>
-              <w:t>Este endpoint está diseñado y documentado en Swagger para la siguiente etapa, pero actualmente responde 404 NOT_FOUND porque el servicio de lectura de nodo aún no fue programado. El frontend no debe intentar llamarlo todavía.</w:t>
+              <w:t>El servidor guarda la lectura 10 segundos para no consultar Proxmox en cada pedido. Si Proxmox no responde, devuelve la última lectura conocida con stale: true; fetchedAt indica cuándo se obtuvo, para mostrar su antigüedad. Solo si nunca hubo una lectura responde 502 o 504.</w:t>
             </w:r>
           </w:p>
         </w:tc>
       </w:tr>
     </w:tbl>
+    <w:p>
+      <w:pPr>
+        <w:spacing w:after="120"/>
+      </w:pPr>
+    </w:p>
     <w:p>
       <w:pPr>
         <w:spacing w:after="80"/>

</xml_diff>

<commit_message>
feat(tareas): recuperación de tareas en curso al arrancar con ventana de 3 minutos
</commit_message>
<xml_diff>
--- a/docs/Contrato de Integracion Etapa 1.docx
+++ b/docs/Contrato de Integracion Etapa 1.docx
@@ -4397,7 +4397,7 @@
               <w:rPr>
                 <w:sz w:val="19"/>
               </w:rPr>
-              <w:t>Proxmox no la dio por terminada en 10 minutos.</w:t>
+              <w:t>Proxmox no la dio por terminada en 10 minutos. Si el backend se reinició, al arrancar las tareas de más de 3 minutos se consultan una sola vez y, si no terminaron, vencen.</w:t>
             </w:r>
           </w:p>
         </w:tc>
@@ -4417,7 +4417,7 @@
               <w:rPr>
                 <w:sz w:val="19"/>
               </w:rPr>
-              <w:t>exitstatus es null; error lo explica.</w:t>
+              <w:t>exitstatus es null; error dice "Excedido el límite máximo de ejecución de N minutos".</w:t>
             </w:r>
           </w:p>
         </w:tc>

</xml_diff>

<commit_message>
fix(metricas): CPU en porcentaje y null con la instancia apagada en todas las salidas
</commit_message>
<xml_diff>
--- a/docs/Contrato de Integracion Etapa 1.docx
+++ b/docs/Contrato de Integracion Etapa 1.docx
@@ -1254,7 +1254,7 @@
               <w:rPr>
                 <w:sz w:val="19"/>
               </w:rPr>
-              <w:t>Decimal (0 a 1)</w:t>
+              <w:t>Decimal (0 a 100) o null</w:t>
             </w:r>
           </w:p>
         </w:tc>
@@ -1274,7 +1274,7 @@
               <w:rPr>
                 <w:sz w:val="19"/>
               </w:rPr>
-              <w:t>Porcentaje de uso actual de procesador (0 cuando está apagada).</w:t>
+              <w:t>Porcentaje de uso actual del procesador, de 0 a 100. null cuando la máquina está apagada.</w:t>
             </w:r>
           </w:p>
         </w:tc>
@@ -1316,7 +1316,7 @@
               <w:rPr>
                 <w:sz w:val="19"/>
               </w:rPr>
-              <w:t>Entero (bytes)</w:t>
+              <w:t>Entero (bytes) o null</w:t>
             </w:r>
           </w:p>
         </w:tc>
@@ -1336,7 +1336,7 @@
               <w:rPr>
                 <w:sz w:val="19"/>
               </w:rPr>
-              <w:t>Memoria RAM actualmente consumida en bytes.</w:t>
+              <w:t>Memoria RAM actualmente consumida en bytes. null cuando la máquina está apagada.</w:t>
             </w:r>
           </w:p>
         </w:tc>
@@ -1882,7 +1882,7 @@
               <w:br/>
               <w:t xml:space="preserve">    "ip": "192.168.1.110",</w:t>
               <w:br/>
-              <w:t xml:space="preserve">    "cpuUsage": 0.24,</w:t>
+              <w:t xml:space="preserve">    "cpuUsage": 24.5,</w:t>
               <w:br/>
               <w:t xml:space="preserve">    "ramUsage": 2147483648,</w:t>
               <w:br/>
@@ -1908,9 +1908,9 @@
               <w:br/>
               <w:t xml:space="preserve">    "ip": null,</w:t>
               <w:br/>
-              <w:t xml:space="preserve">    "cpuUsage": 0,</w:t>
+              <w:t xml:space="preserve">    "cpuUsage": null,</w:t>
               <w:br/>
-              <w:t xml:space="preserve">    "ramUsage": 0,</w:t>
+              <w:t xml:space="preserve">    "ramUsage": null,</w:t>
               <w:br/>
               <w:t xml:space="preserve">    "maxRam": 1073741824,</w:t>
               <w:br/>

</xml_diff>

<commit_message>
fix(instances): ofuscar VMID con referencias públicas contra IDOR y enumeración
</commit_message>
<xml_diff>
--- a/docs/Contrato de Integracion Etapa 1.docx
+++ b/docs/Contrato de Integracion Etapa 1.docx
@@ -227,7 +227,7 @@
               <w:rPr>
                 <w:sz w:val="19"/>
               </w:rPr>
-              <w:t>POST /api/instances/:vmid/start</w:t>
+              <w:t>POST /api/instances/:instanceRef/start</w:t>
             </w:r>
           </w:p>
         </w:tc>
@@ -289,7 +289,7 @@
               <w:rPr>
                 <w:sz w:val="19"/>
               </w:rPr>
-              <w:t>POST /api/instances/:vmid/stop</w:t>
+              <w:t>POST /api/instances/:instanceRef/stop</w:t>
             </w:r>
           </w:p>
         </w:tc>
@@ -351,7 +351,7 @@
               <w:rPr>
                 <w:sz w:val="19"/>
               </w:rPr>
-              <w:t>POST /api/instances/:vmid/status/:action</w:t>
+              <w:t>POST /api/instances/:instanceRef/status/:action</w:t>
             </w:r>
           </w:p>
         </w:tc>
@@ -413,7 +413,7 @@
               <w:rPr>
                 <w:sz w:val="19"/>
               </w:rPr>
-              <w:t>DELETE /api/instances/:vmid</w:t>
+              <w:t>DELETE /api/instances/:instanceRef</w:t>
             </w:r>
           </w:p>
         </w:tc>
@@ -661,7 +661,7 @@
               <w:rPr>
                 <w:sz w:val="19"/>
               </w:rPr>
-              <w:t>POST /api/instances/:vmid/pause</w:t>
+              <w:t>POST /api/instances/:instanceRef/pause</w:t>
             </w:r>
           </w:p>
         </w:tc>
@@ -882,7 +882,7 @@
               <w:rPr>
                 <w:sz w:val="19"/>
               </w:rPr>
-              <w:t>Número entero</w:t>
+              <w:t>Texto</w:t>
             </w:r>
           </w:p>
         </w:tc>
@@ -902,7 +902,7 @@
               <w:rPr>
                 <w:sz w:val="19"/>
               </w:rPr>
-              <w:t>Identificador único (VMID) de la máquina en Proxmox.</w:t>
+              <w:t>Referencia pública de la máquina (inst_ + 22 letras y números). No es el VMID de Proxmox: no se puede adivinar ni deducir. Es la que se usa en todas las rutas de la instancia.</w:t>
             </w:r>
           </w:p>
         </w:tc>
@@ -2394,7 +2394,7 @@
         <w:spacing w:before="0" w:after="120" w:line="276" w:lineRule="auto"/>
       </w:pPr>
       <w:r>
-        <w:t>DELETE /api/instances/:vmid elimina para siempre una máquina o contenedor. Solo lo puede usar un ADMIN: un OPERATOR recibe 403 INSUFFICIENT_PERMISSIONS. Las máquinas protegidas de la infraestructura responden 403 INSTANCE_PROTECTED.</w:t>
+        <w:t>DELETE /api/instances/:instanceRef elimina para siempre una máquina o contenedor. Solo lo puede usar un ADMIN: un OPERATOR recibe 403 INSUFFICIENT_PERMISSIONS. Las máquinas protegidas de la infraestructura responden 403 INSTANCE_PROTECTED.</w:t>
       </w:r>
     </w:p>
     <w:p>
@@ -2616,68 +2616,6 @@
                 <w:sz w:val="20"/>
               </w:rPr>
               <w:t>Significado y Acción Recomendada</w:t>
-            </w:r>
-          </w:p>
-        </w:tc>
-      </w:tr>
-      <w:tr>
-        <w:tc>
-          <w:tcPr>
-            <w:tcW w:type="dxa" w:w="3216"/>
-            <w:shd w:fill="FFFFFF"/>
-            <w:tcMar>
-              <w:top w:w="100" w:type="dxa"/>
-              <w:bottom w:w="100" w:type="dxa"/>
-              <w:left w:w="140" w:type="dxa"/>
-              <w:right w:w="140" w:type="dxa"/>
-            </w:tcMar>
-          </w:tcPr>
-          <w:p>
-            <w:r>
-              <w:rPr>
-                <w:sz w:val="19"/>
-              </w:rPr>
-              <w:t>400</w:t>
-            </w:r>
-          </w:p>
-        </w:tc>
-        <w:tc>
-          <w:tcPr>
-            <w:tcW w:type="dxa" w:w="3216"/>
-            <w:shd w:fill="FFFFFF"/>
-            <w:tcMar>
-              <w:top w:w="100" w:type="dxa"/>
-              <w:bottom w:w="100" w:type="dxa"/>
-              <w:left w:w="140" w:type="dxa"/>
-              <w:right w:w="140" w:type="dxa"/>
-            </w:tcMar>
-          </w:tcPr>
-          <w:p>
-            <w:r>
-              <w:rPr>
-                <w:sz w:val="19"/>
-              </w:rPr>
-              <w:t>INVALID_VMID</w:t>
-            </w:r>
-          </w:p>
-        </w:tc>
-        <w:tc>
-          <w:tcPr>
-            <w:tcW w:type="dxa" w:w="3216"/>
-            <w:shd w:fill="FFFFFF"/>
-            <w:tcMar>
-              <w:top w:w="100" w:type="dxa"/>
-              <w:bottom w:w="100" w:type="dxa"/>
-              <w:left w:w="140" w:type="dxa"/>
-              <w:right w:w="140" w:type="dxa"/>
-            </w:tcMar>
-          </w:tcPr>
-          <w:p>
-            <w:r>
-              <w:rPr>
-                <w:sz w:val="19"/>
-              </w:rPr>
-              <w:t>El ID de la máquina en la URL no es un número válido.</w:t>
             </w:r>
           </w:p>
         </w:tc>
@@ -3029,7 +2967,7 @@
               <w:rPr>
                 <w:sz w:val="19"/>
               </w:rPr>
-              <w:t>INSTANCE_NOT_FOUND</w:t>
+              <w:t>RESOURCE_NOT_FOUND</w:t>
             </w:r>
           </w:p>
         </w:tc>
@@ -3049,7 +2987,7 @@
               <w:rPr>
                 <w:sz w:val="19"/>
               </w:rPr>
-              <w:t>La máquina virtual no existe en el cluster de Proxmox.</w:t>
+              <w:t>La máquina no existe, o la referencia de la URL no es válida (alterada, inventada o un número). Las dos situaciones responden exactamente igual.</w:t>
             </w:r>
           </w:p>
         </w:tc>

</xml_diff>